<commit_message>
Reader/Lead Reader Report Word: readable checkboxes
The forms' cells are Times New Roman, which has no ☐/☒ glyphs, so Word
showed gibberish in every Compliant/Non-Compliant box and the Lead Reader
Report's status / degree level / recommendation were unreadable (Lauri).
- fillTemplate gives every box its own MS Gothic run (the font the forms'
  own checkbox controls use); the lead report does the same and bolds the
  chosen option, as the PDF does.
- The standard-level box runs sat before <w:pPr> (invalid OOXML):
  prepare_reader_report_templates.py now inserts after it, and
  fix_template_run_order.py repaired the shipped templates.

Co-Authored-By: Claude Opus 5.5 <noreply@anthropic.com>
</commit_message>
<xml_diff>
--- a/CSHSE/server/src/assets/reader-report-templates/associate.docx
+++ b/CSHSE/server/src/assets/reader-report-templates/associate.docx
@@ -389,9 +389,6 @@
             <w:vAlign w:val="center"/>
           </w:tcPr>
           <w:p>
-            <w:r>
-              <w:t xml:space="preserve">{{c_introduction}} </w:t>
-            </w:r>
             <w:pPr>
               <w:spacing w:after="0" w:line="240" w:lineRule="auto"/>
               <w:ind w:left="113" w:right="113"/>
@@ -401,6 +398,9 @@
                 <w:b/>
               </w:rPr>
             </w:pPr>
+            <w:r>
+              <w:t xml:space="preserve">{{c_introduction}} </w:t>
+            </w:r>
             <w:r>
               <w:rPr>
                 <w:rFonts w:ascii="Times New Roman" w:eastAsia="Times New Roman" w:hAnsi="Times New Roman" w:cs="Times New Roman"/>
@@ -418,9 +418,6 @@
             <w:vAlign w:val="center"/>
           </w:tcPr>
           <w:p>
-            <w:r>
-              <w:t xml:space="preserve">{{n_introduction}} </w:t>
-            </w:r>
             <w:pPr>
               <w:spacing w:after="0" w:line="240" w:lineRule="auto"/>
               <w:ind w:left="113" w:right="113"/>
@@ -430,6 +427,9 @@
                 <w:b/>
               </w:rPr>
             </w:pPr>
+            <w:r>
+              <w:t xml:space="preserve">{{n_introduction}} </w:t>
+            </w:r>
             <w:r>
               <w:rPr>
                 <w:rFonts w:ascii="Times New Roman" w:eastAsia="Times New Roman" w:hAnsi="Times New Roman" w:cs="Times New Roman"/>
@@ -2604,9 +2604,6 @@
             <w:vAlign w:val="center"/>
           </w:tcPr>
           <w:p>
-            <w:r>
-              <w:t xml:space="preserve">{{c_1}} </w:t>
-            </w:r>
             <w:pPr>
               <w:spacing w:after="0" w:line="240" w:lineRule="auto"/>
               <w:ind w:left="113" w:right="113"/>
@@ -2616,6 +2613,9 @@
                 <w:b/>
               </w:rPr>
             </w:pPr>
+            <w:r>
+              <w:t xml:space="preserve">{{c_1}} </w:t>
+            </w:r>
             <w:r>
               <w:rPr>
                 <w:rFonts w:ascii="Times New Roman" w:eastAsia="Times New Roman" w:hAnsi="Times New Roman" w:cs="Times New Roman"/>
@@ -2633,9 +2633,6 @@
             <w:vAlign w:val="center"/>
           </w:tcPr>
           <w:p>
-            <w:r>
-              <w:t xml:space="preserve">{{n_1}} </w:t>
-            </w:r>
             <w:pPr>
               <w:spacing w:after="0" w:line="240" w:lineRule="auto"/>
               <w:ind w:left="113" w:right="113"/>
@@ -2645,6 +2642,9 @@
                 <w:b/>
               </w:rPr>
             </w:pPr>
+            <w:r>
+              <w:t xml:space="preserve">{{n_1}} </w:t>
+            </w:r>
             <w:r>
               <w:rPr>
                 <w:rFonts w:ascii="Times New Roman" w:eastAsia="Times New Roman" w:hAnsi="Times New Roman" w:cs="Times New Roman"/>
@@ -3400,9 +3400,6 @@
             <w:vAlign w:val="center"/>
           </w:tcPr>
           <w:p>
-            <w:r>
-              <w:t xml:space="preserve">{{c_2}} </w:t>
-            </w:r>
             <w:pPr>
               <w:spacing w:after="0" w:line="240" w:lineRule="auto"/>
               <w:ind w:left="113" w:right="113"/>
@@ -3412,6 +3409,9 @@
                 <w:b/>
               </w:rPr>
             </w:pPr>
+            <w:r>
+              <w:t xml:space="preserve">{{c_2}} </w:t>
+            </w:r>
             <w:r>
               <w:rPr>
                 <w:rFonts w:ascii="Times New Roman" w:eastAsia="Times New Roman" w:hAnsi="Times New Roman" w:cs="Times New Roman"/>
@@ -3429,9 +3429,6 @@
             <w:vAlign w:val="center"/>
           </w:tcPr>
           <w:p>
-            <w:r>
-              <w:t xml:space="preserve">{{n_2}} </w:t>
-            </w:r>
             <w:pPr>
               <w:spacing w:after="0" w:line="240" w:lineRule="auto"/>
               <w:ind w:left="113" w:right="113"/>
@@ -3441,6 +3438,9 @@
                 <w:b/>
               </w:rPr>
             </w:pPr>
+            <w:r>
+              <w:t xml:space="preserve">{{n_2}} </w:t>
+            </w:r>
             <w:r>
               <w:rPr>
                 <w:rFonts w:ascii="Times New Roman" w:eastAsia="Times New Roman" w:hAnsi="Times New Roman" w:cs="Times New Roman"/>
@@ -4119,17 +4119,17 @@
             <w:vAlign w:val="center"/>
           </w:tcPr>
           <w:p>
+            <w:pPr>
+              <w:spacing w:after="0" w:line="240" w:lineRule="auto"/>
+              <w:ind w:left="113" w:right="113"/>
+              <w:rPr>
+                <w:rFonts w:ascii="Times New Roman" w:eastAsia="Times New Roman" w:hAnsi="Times New Roman" w:cs="Times New Roman"/>
+                <w:b/>
+              </w:rPr>
+            </w:pPr>
             <w:r>
               <w:t xml:space="preserve">{{c_3}} </w:t>
             </w:r>
-            <w:pPr>
-              <w:spacing w:after="0" w:line="240" w:lineRule="auto"/>
-              <w:ind w:left="113" w:right="113"/>
-              <w:rPr>
-                <w:rFonts w:ascii="Times New Roman" w:eastAsia="Times New Roman" w:hAnsi="Times New Roman" w:cs="Times New Roman"/>
-                <w:b/>
-              </w:rPr>
-            </w:pPr>
             <w:r>
               <w:rPr>
                 <w:rFonts w:ascii="Times New Roman" w:eastAsia="Times New Roman" w:hAnsi="Times New Roman" w:cs="Times New Roman"/>
@@ -4147,18 +4147,18 @@
             <w:vAlign w:val="center"/>
           </w:tcPr>
           <w:p>
+            <w:pPr>
+              <w:pStyle w:val="ListParagraph"/>
+              <w:spacing w:after="0" w:line="240" w:lineRule="auto"/>
+              <w:ind w:left="113" w:right="113"/>
+              <w:rPr>
+                <w:rFonts w:ascii="Times New Roman" w:eastAsia="Times New Roman" w:hAnsi="Times New Roman" w:cs="Times New Roman"/>
+                <w:b/>
+              </w:rPr>
+            </w:pPr>
             <w:r>
               <w:t xml:space="preserve">{{n_3}} </w:t>
             </w:r>
-            <w:pPr>
-              <w:pStyle w:val="ListParagraph"/>
-              <w:spacing w:after="0" w:line="240" w:lineRule="auto"/>
-              <w:ind w:left="113" w:right="113"/>
-              <w:rPr>
-                <w:rFonts w:ascii="Times New Roman" w:eastAsia="Times New Roman" w:hAnsi="Times New Roman" w:cs="Times New Roman"/>
-                <w:b/>
-              </w:rPr>
-            </w:pPr>
             <w:r>
               <w:rPr>
                 <w:rFonts w:ascii="Times New Roman" w:eastAsia="Times New Roman" w:hAnsi="Times New Roman" w:cs="Times New Roman"/>
@@ -5053,17 +5053,17 @@
             <w:vAlign w:val="center"/>
           </w:tcPr>
           <w:p>
+            <w:pPr>
+              <w:spacing w:after="0" w:line="240" w:lineRule="auto"/>
+              <w:ind w:left="113" w:right="113"/>
+              <w:rPr>
+                <w:rFonts w:ascii="Times New Roman" w:eastAsia="Times New Roman" w:hAnsi="Times New Roman" w:cs="Times New Roman"/>
+                <w:b/>
+              </w:rPr>
+            </w:pPr>
             <w:r>
               <w:t xml:space="preserve">{{c_4}} </w:t>
             </w:r>
-            <w:pPr>
-              <w:spacing w:after="0" w:line="240" w:lineRule="auto"/>
-              <w:ind w:left="113" w:right="113"/>
-              <w:rPr>
-                <w:rFonts w:ascii="Times New Roman" w:eastAsia="Times New Roman" w:hAnsi="Times New Roman" w:cs="Times New Roman"/>
-                <w:b/>
-              </w:rPr>
-            </w:pPr>
             <w:r>
               <w:rPr>
                 <w:rFonts w:ascii="Times New Roman" w:eastAsia="Times New Roman" w:hAnsi="Times New Roman" w:cs="Times New Roman"/>
@@ -5081,9 +5081,6 @@
             <w:vAlign w:val="center"/>
           </w:tcPr>
           <w:p>
-            <w:r>
-              <w:t xml:space="preserve">{{n_4}} </w:t>
-            </w:r>
             <w:pPr>
               <w:spacing w:after="0" w:line="240" w:lineRule="auto"/>
               <w:ind w:left="113" w:right="113"/>
@@ -5093,6 +5090,9 @@
                 <w:b/>
               </w:rPr>
             </w:pPr>
+            <w:r>
+              <w:t xml:space="preserve">{{n_4}} </w:t>
+            </w:r>
             <w:r>
               <w:rPr>
                 <w:rFonts w:ascii="Times New Roman" w:eastAsia="Times New Roman" w:hAnsi="Times New Roman" w:cs="Times New Roman"/>
@@ -6394,9 +6394,6 @@
             <w:vAlign w:val="center"/>
           </w:tcPr>
           <w:p>
-            <w:r>
-              <w:t xml:space="preserve">{{c_5}} </w:t>
-            </w:r>
             <w:pPr>
               <w:spacing w:after="0" w:line="240" w:lineRule="auto"/>
               <w:ind w:left="113" w:right="113"/>
@@ -6406,6 +6403,9 @@
                 <w:b/>
               </w:rPr>
             </w:pPr>
+            <w:r>
+              <w:t xml:space="preserve">{{c_5}} </w:t>
+            </w:r>
             <w:r>
               <w:rPr>
                 <w:rFonts w:ascii="Times New Roman" w:eastAsia="Times New Roman" w:hAnsi="Times New Roman" w:cs="Times New Roman"/>
@@ -6423,9 +6423,6 @@
             <w:vAlign w:val="center"/>
           </w:tcPr>
           <w:p>
-            <w:r>
-              <w:t xml:space="preserve">{{n_5}} </w:t>
-            </w:r>
             <w:pPr>
               <w:spacing w:after="0" w:line="240" w:lineRule="auto"/>
               <w:ind w:left="113" w:right="113"/>
@@ -6435,6 +6432,9 @@
                 <w:b/>
               </w:rPr>
             </w:pPr>
+            <w:r>
+              <w:t xml:space="preserve">{{n_5}} </w:t>
+            </w:r>
             <w:r>
               <w:rPr>
                 <w:rFonts w:ascii="Times New Roman" w:eastAsia="Times New Roman" w:hAnsi="Times New Roman" w:cs="Times New Roman"/>
@@ -6997,9 +6997,6 @@
             <w:vAlign w:val="center"/>
           </w:tcPr>
           <w:p>
-            <w:r>
-              <w:t xml:space="preserve">{{c_6}} </w:t>
-            </w:r>
             <w:pPr>
               <w:spacing w:after="0" w:line="240" w:lineRule="auto"/>
               <w:ind w:left="113" w:right="113"/>
@@ -7009,6 +7006,9 @@
                 <w:b/>
               </w:rPr>
             </w:pPr>
+            <w:r>
+              <w:t xml:space="preserve">{{c_6}} </w:t>
+            </w:r>
             <w:r>
               <w:rPr>
                 <w:rFonts w:ascii="Times New Roman" w:eastAsia="Times New Roman" w:hAnsi="Times New Roman" w:cs="Times New Roman"/>
@@ -7026,9 +7026,6 @@
             <w:vAlign w:val="center"/>
           </w:tcPr>
           <w:p>
-            <w:r>
-              <w:t xml:space="preserve">{{n_6}} </w:t>
-            </w:r>
             <w:pPr>
               <w:spacing w:after="0" w:line="240" w:lineRule="auto"/>
               <w:ind w:left="113" w:right="113"/>
@@ -7038,6 +7035,9 @@
                 <w:b/>
               </w:rPr>
             </w:pPr>
+            <w:r>
+              <w:t xml:space="preserve">{{n_6}} </w:t>
+            </w:r>
             <w:r>
               <w:rPr>
                 <w:rFonts w:ascii="Times New Roman" w:eastAsia="Times New Roman" w:hAnsi="Times New Roman" w:cs="Times New Roman"/>
@@ -7487,9 +7487,6 @@
             <w:vAlign w:val="center"/>
           </w:tcPr>
           <w:p>
-            <w:r>
-              <w:t xml:space="preserve">{{c_7}} </w:t>
-            </w:r>
             <w:pPr>
               <w:spacing w:after="0" w:line="240" w:lineRule="auto"/>
               <w:ind w:left="113" w:right="113"/>
@@ -7499,6 +7496,9 @@
                 <w:b/>
               </w:rPr>
             </w:pPr>
+            <w:r>
+              <w:t xml:space="preserve">{{c_7}} </w:t>
+            </w:r>
             <w:r>
               <w:rPr>
                 <w:rFonts w:ascii="Times New Roman" w:eastAsia="Times New Roman" w:hAnsi="Times New Roman" w:cs="Times New Roman"/>
@@ -7516,9 +7516,6 @@
             <w:vAlign w:val="center"/>
           </w:tcPr>
           <w:p>
-            <w:r>
-              <w:t xml:space="preserve">{{n_7}} </w:t>
-            </w:r>
             <w:pPr>
               <w:spacing w:after="0" w:line="240" w:lineRule="auto"/>
               <w:ind w:left="113" w:right="113"/>
@@ -7528,6 +7525,9 @@
                 <w:b/>
               </w:rPr>
             </w:pPr>
+            <w:r>
+              <w:t xml:space="preserve">{{n_7}} </w:t>
+            </w:r>
             <w:r>
               <w:rPr>
                 <w:rFonts w:ascii="Times New Roman" w:eastAsia="Times New Roman" w:hAnsi="Times New Roman" w:cs="Times New Roman"/>
@@ -8365,9 +8365,6 @@
             <w:vAlign w:val="center"/>
           </w:tcPr>
           <w:p>
-            <w:r>
-              <w:t xml:space="preserve">{{c_8}} </w:t>
-            </w:r>
             <w:pPr>
               <w:spacing w:after="0" w:line="240" w:lineRule="auto"/>
               <w:ind w:left="113" w:right="113"/>
@@ -8377,6 +8374,9 @@
                 <w:b/>
               </w:rPr>
             </w:pPr>
+            <w:r>
+              <w:t xml:space="preserve">{{c_8}} </w:t>
+            </w:r>
             <w:r>
               <w:rPr>
                 <w:rFonts w:ascii="Times New Roman" w:eastAsia="Times New Roman" w:hAnsi="Times New Roman" w:cs="Times New Roman"/>
@@ -8394,9 +8394,6 @@
             <w:vAlign w:val="center"/>
           </w:tcPr>
           <w:p>
-            <w:r>
-              <w:t xml:space="preserve">{{n_8}} </w:t>
-            </w:r>
             <w:pPr>
               <w:spacing w:after="0" w:line="240" w:lineRule="auto"/>
               <w:ind w:left="113" w:right="113"/>
@@ -8406,6 +8403,9 @@
                 <w:b/>
               </w:rPr>
             </w:pPr>
+            <w:r>
+              <w:t xml:space="preserve">{{n_8}} </w:t>
+            </w:r>
             <w:r>
               <w:rPr>
                 <w:rFonts w:ascii="Times New Roman" w:eastAsia="Times New Roman" w:hAnsi="Times New Roman" w:cs="Times New Roman"/>
@@ -9074,9 +9074,6 @@
             <w:vAlign w:val="center"/>
           </w:tcPr>
           <w:p>
-            <w:r>
-              <w:t xml:space="preserve">{{c_9}} </w:t>
-            </w:r>
             <w:pPr>
               <w:spacing w:after="0" w:line="240" w:lineRule="auto"/>
               <w:ind w:left="113" w:right="113"/>
@@ -9086,6 +9083,9 @@
                 <w:b/>
               </w:rPr>
             </w:pPr>
+            <w:r>
+              <w:t xml:space="preserve">{{c_9}} </w:t>
+            </w:r>
             <w:r>
               <w:rPr>
                 <w:rFonts w:ascii="Times New Roman" w:eastAsia="Times New Roman" w:hAnsi="Times New Roman" w:cs="Times New Roman"/>
@@ -9103,9 +9103,6 @@
             <w:vAlign w:val="center"/>
           </w:tcPr>
           <w:p>
-            <w:r>
-              <w:t xml:space="preserve">{{n_9}} </w:t>
-            </w:r>
             <w:pPr>
               <w:spacing w:after="0" w:line="240" w:lineRule="auto"/>
               <w:ind w:left="113" w:right="113"/>
@@ -9115,6 +9112,9 @@
                 <w:b/>
               </w:rPr>
             </w:pPr>
+            <w:r>
+              <w:t xml:space="preserve">{{n_9}} </w:t>
+            </w:r>
             <w:r>
               <w:rPr>
                 <w:rFonts w:ascii="Times New Roman" w:eastAsia="Times New Roman" w:hAnsi="Times New Roman" w:cs="Times New Roman"/>
@@ -9801,9 +9801,6 @@
             <w:vAlign w:val="center"/>
           </w:tcPr>
           <w:p>
-            <w:r>
-              <w:t xml:space="preserve">{{c_10}} </w:t>
-            </w:r>
             <w:pPr>
               <w:spacing w:after="0" w:line="240" w:lineRule="auto"/>
               <w:ind w:left="113" w:right="113"/>
@@ -9813,6 +9810,9 @@
                 <w:b/>
               </w:rPr>
             </w:pPr>
+            <w:r>
+              <w:t xml:space="preserve">{{c_10}} </w:t>
+            </w:r>
             <w:r>
               <w:rPr>
                 <w:rFonts w:ascii="Times New Roman" w:eastAsia="Times New Roman" w:hAnsi="Times New Roman" w:cs="Times New Roman"/>
@@ -9830,9 +9830,6 @@
             <w:vAlign w:val="center"/>
           </w:tcPr>
           <w:p>
-            <w:r>
-              <w:t xml:space="preserve">{{n_10}} </w:t>
-            </w:r>
             <w:pPr>
               <w:spacing w:after="0" w:line="240" w:lineRule="auto"/>
               <w:ind w:left="113" w:right="113"/>
@@ -9842,6 +9839,9 @@
                 <w:b/>
               </w:rPr>
             </w:pPr>
+            <w:r>
+              <w:t xml:space="preserve">{{n_10}} </w:t>
+            </w:r>
             <w:r>
               <w:rPr>
                 <w:rFonts w:ascii="Times New Roman" w:eastAsia="Times New Roman" w:hAnsi="Times New Roman" w:cs="Times New Roman"/>
@@ -10328,9 +10328,6 @@
             <w:vAlign w:val="center"/>
           </w:tcPr>
           <w:p>
-            <w:r>
-              <w:t xml:space="preserve">{{c_11}} </w:t>
-            </w:r>
             <w:pPr>
               <w:spacing w:after="0" w:line="240" w:lineRule="auto"/>
               <w:ind w:left="113" w:right="113"/>
@@ -10341,6 +10338,9 @@
                 <w:bCs/>
               </w:rPr>
             </w:pPr>
+            <w:r>
+              <w:t xml:space="preserve">{{c_11}} </w:t>
+            </w:r>
             <w:r>
               <w:rPr>
                 <w:rFonts w:ascii="Times New Roman" w:eastAsia="Times New Roman" w:hAnsi="Times New Roman" w:cs="Times New Roman"/>
@@ -10358,9 +10358,6 @@
             <w:vAlign w:val="center"/>
           </w:tcPr>
           <w:p>
-            <w:r>
-              <w:t xml:space="preserve">{{n_11}} </w:t>
-            </w:r>
             <w:pPr>
               <w:spacing w:after="0" w:line="240" w:lineRule="auto"/>
               <w:ind w:left="113" w:right="113"/>
@@ -10371,6 +10368,9 @@
                 <w:bCs/>
               </w:rPr>
             </w:pPr>
+            <w:r>
+              <w:t xml:space="preserve">{{n_11}} </w:t>
+            </w:r>
             <w:r>
               <w:rPr>
                 <w:rFonts w:ascii="Times New Roman" w:eastAsia="Times New Roman" w:hAnsi="Times New Roman" w:cs="Times New Roman"/>
@@ -11136,9 +11136,6 @@
             <w:vAlign w:val="center"/>
           </w:tcPr>
           <w:p>
-            <w:r>
-              <w:t xml:space="preserve">{{c_12}} </w:t>
-            </w:r>
             <w:pPr>
               <w:spacing w:after="0" w:line="240" w:lineRule="auto"/>
               <w:ind w:left="113" w:right="113"/>
@@ -11149,6 +11146,9 @@
                 <w:bCs/>
               </w:rPr>
             </w:pPr>
+            <w:r>
+              <w:t xml:space="preserve">{{c_12}} </w:t>
+            </w:r>
             <w:r>
               <w:rPr>
                 <w:rFonts w:ascii="Times New Roman" w:eastAsia="Times New Roman" w:hAnsi="Times New Roman" w:cs="Times New Roman"/>
@@ -11166,9 +11166,6 @@
             <w:vAlign w:val="center"/>
           </w:tcPr>
           <w:p>
-            <w:r>
-              <w:t xml:space="preserve">{{n_12}} </w:t>
-            </w:r>
             <w:pPr>
               <w:spacing w:after="0" w:line="240" w:lineRule="auto"/>
               <w:ind w:left="113" w:right="113"/>
@@ -11179,6 +11176,9 @@
                 <w:bCs/>
               </w:rPr>
             </w:pPr>
+            <w:r>
+              <w:t xml:space="preserve">{{n_12}} </w:t>
+            </w:r>
             <w:r>
               <w:rPr>
                 <w:rFonts w:ascii="Times New Roman" w:eastAsia="Times New Roman" w:hAnsi="Times New Roman" w:cs="Times New Roman"/>
@@ -12367,9 +12367,6 @@
             <w:vAlign w:val="center"/>
           </w:tcPr>
           <w:p>
-            <w:r>
-              <w:t xml:space="preserve">{{c_13}} </w:t>
-            </w:r>
             <w:pPr>
               <w:spacing w:after="0" w:line="240" w:lineRule="auto"/>
               <w:ind w:left="113" w:right="113"/>
@@ -12380,6 +12377,9 @@
                 <w:bCs/>
               </w:rPr>
             </w:pPr>
+            <w:r>
+              <w:t xml:space="preserve">{{c_13}} </w:t>
+            </w:r>
             <w:r>
               <w:rPr>
                 <w:rFonts w:ascii="Times New Roman" w:eastAsia="Times New Roman" w:hAnsi="Times New Roman" w:cs="Times New Roman"/>
@@ -12397,9 +12397,6 @@
             <w:vAlign w:val="center"/>
           </w:tcPr>
           <w:p>
-            <w:r>
-              <w:t xml:space="preserve">{{n_13}} </w:t>
-            </w:r>
             <w:pPr>
               <w:spacing w:after="0" w:line="240" w:lineRule="auto"/>
               <w:ind w:left="113" w:right="113"/>
@@ -12410,6 +12407,9 @@
                 <w:bCs/>
               </w:rPr>
             </w:pPr>
+            <w:r>
+              <w:t xml:space="preserve">{{n_13}} </w:t>
+            </w:r>
             <w:r>
               <w:rPr>
                 <w:rFonts w:ascii="Times New Roman" w:eastAsia="Times New Roman" w:hAnsi="Times New Roman" w:cs="Times New Roman"/>
@@ -13073,9 +13073,6 @@
             <w:vAlign w:val="center"/>
           </w:tcPr>
           <w:p>
-            <w:r>
-              <w:t xml:space="preserve">{{c_14}} </w:t>
-            </w:r>
             <w:pPr>
               <w:spacing w:after="0" w:line="240" w:lineRule="auto"/>
               <w:ind w:left="113" w:right="113"/>
@@ -13086,6 +13083,9 @@
                 <w:bCs/>
               </w:rPr>
             </w:pPr>
+            <w:r>
+              <w:t xml:space="preserve">{{c_14}} </w:t>
+            </w:r>
             <w:r>
               <w:rPr>
                 <w:rFonts w:ascii="Times New Roman" w:eastAsia="Times New Roman" w:hAnsi="Times New Roman" w:cs="Times New Roman"/>
@@ -13103,9 +13103,6 @@
             <w:vAlign w:val="center"/>
           </w:tcPr>
           <w:p>
-            <w:r>
-              <w:t xml:space="preserve">{{n_14}} </w:t>
-            </w:r>
             <w:pPr>
               <w:spacing w:after="0" w:line="240" w:lineRule="auto"/>
               <w:ind w:left="113" w:right="113"/>
@@ -13116,6 +13113,9 @@
                 <w:bCs/>
               </w:rPr>
             </w:pPr>
+            <w:r>
+              <w:t xml:space="preserve">{{n_14}} </w:t>
+            </w:r>
             <w:r>
               <w:rPr>
                 <w:rFonts w:ascii="Times New Roman" w:eastAsia="Times New Roman" w:hAnsi="Times New Roman" w:cs="Times New Roman"/>
@@ -13865,9 +13865,6 @@
             <w:vAlign w:val="center"/>
           </w:tcPr>
           <w:p>
-            <w:r>
-              <w:t xml:space="preserve">{{c_15}} </w:t>
-            </w:r>
             <w:pPr>
               <w:spacing w:after="0" w:line="240" w:lineRule="auto"/>
               <w:ind w:left="113" w:right="113"/>
@@ -13878,6 +13875,9 @@
                 <w:bCs/>
               </w:rPr>
             </w:pPr>
+            <w:r>
+              <w:t xml:space="preserve">{{c_15}} </w:t>
+            </w:r>
             <w:r>
               <w:rPr>
                 <w:rFonts w:ascii="Times New Roman" w:eastAsia="Times New Roman" w:hAnsi="Times New Roman" w:cs="Times New Roman"/>
@@ -13895,9 +13895,6 @@
             <w:vAlign w:val="center"/>
           </w:tcPr>
           <w:p>
-            <w:r>
-              <w:t xml:space="preserve">{{n_15}} </w:t>
-            </w:r>
             <w:pPr>
               <w:spacing w:after="0" w:line="240" w:lineRule="auto"/>
               <w:ind w:left="113" w:right="113"/>
@@ -13908,6 +13905,9 @@
                 <w:bCs/>
               </w:rPr>
             </w:pPr>
+            <w:r>
+              <w:t xml:space="preserve">{{n_15}} </w:t>
+            </w:r>
             <w:r>
               <w:rPr>
                 <w:rFonts w:ascii="Times New Roman" w:eastAsia="Times New Roman" w:hAnsi="Times New Roman" w:cs="Times New Roman"/>
@@ -14531,9 +14531,6 @@
             <w:vAlign w:val="center"/>
           </w:tcPr>
           <w:p>
-            <w:r>
-              <w:t xml:space="preserve">{{c_16}} </w:t>
-            </w:r>
             <w:pPr>
               <w:spacing w:after="0" w:line="240" w:lineRule="auto"/>
               <w:ind w:left="113" w:right="113"/>
@@ -14544,6 +14541,9 @@
                 <w:bCs/>
               </w:rPr>
             </w:pPr>
+            <w:r>
+              <w:t xml:space="preserve">{{c_16}} </w:t>
+            </w:r>
             <w:r>
               <w:rPr>
                 <w:rFonts w:ascii="Times New Roman" w:eastAsia="Times New Roman" w:hAnsi="Times New Roman" w:cs="Times New Roman"/>
@@ -14561,9 +14561,6 @@
             <w:vAlign w:val="center"/>
           </w:tcPr>
           <w:p>
-            <w:r>
-              <w:t xml:space="preserve">{{n_16}} </w:t>
-            </w:r>
             <w:pPr>
               <w:spacing w:after="0" w:line="240" w:lineRule="auto"/>
               <w:ind w:left="113" w:right="113"/>
@@ -14574,6 +14571,9 @@
                 <w:bCs/>
               </w:rPr>
             </w:pPr>
+            <w:r>
+              <w:t xml:space="preserve">{{n_16}} </w:t>
+            </w:r>
             <w:r>
               <w:rPr>
                 <w:rFonts w:ascii="Times New Roman" w:eastAsia="Times New Roman" w:hAnsi="Times New Roman" w:cs="Times New Roman"/>
@@ -15770,9 +15770,6 @@
             <w:vAlign w:val="center"/>
           </w:tcPr>
           <w:p>
-            <w:r>
-              <w:t xml:space="preserve">{{c_17}} </w:t>
-            </w:r>
             <w:pPr>
               <w:spacing w:after="0" w:line="240" w:lineRule="auto"/>
               <w:ind w:left="113" w:right="113"/>
@@ -15783,6 +15780,9 @@
                 <w:bCs/>
               </w:rPr>
             </w:pPr>
+            <w:r>
+              <w:t xml:space="preserve">{{c_17}} </w:t>
+            </w:r>
             <w:r>
               <w:rPr>
                 <w:rFonts w:ascii="Times New Roman" w:eastAsia="Times New Roman" w:hAnsi="Times New Roman" w:cs="Times New Roman"/>
@@ -15800,9 +15800,6 @@
             <w:vAlign w:val="center"/>
           </w:tcPr>
           <w:p>
-            <w:r>
-              <w:t xml:space="preserve">{{n_17}} </w:t>
-            </w:r>
             <w:pPr>
               <w:spacing w:after="0" w:line="240" w:lineRule="auto"/>
               <w:ind w:left="113" w:right="113"/>
@@ -15813,6 +15810,9 @@
                 <w:bCs/>
               </w:rPr>
             </w:pPr>
+            <w:r>
+              <w:t xml:space="preserve">{{n_17}} </w:t>
+            </w:r>
             <w:r>
               <w:rPr>
                 <w:rFonts w:ascii="Times New Roman" w:eastAsia="Times New Roman" w:hAnsi="Times New Roman" w:cs="Times New Roman"/>
@@ -16572,9 +16572,6 @@
             <w:vAlign w:val="center"/>
           </w:tcPr>
           <w:p>
-            <w:r>
-              <w:t xml:space="preserve">{{c_18}} </w:t>
-            </w:r>
             <w:pPr>
               <w:spacing w:after="0" w:line="240" w:lineRule="auto"/>
               <w:ind w:left="113" w:right="113"/>
@@ -16585,6 +16582,9 @@
                 <w:bCs/>
               </w:rPr>
             </w:pPr>
+            <w:r>
+              <w:t xml:space="preserve">{{c_18}} </w:t>
+            </w:r>
             <w:r>
               <w:rPr>
                 <w:rFonts w:ascii="Times New Roman" w:eastAsia="Times New Roman" w:hAnsi="Times New Roman" w:cs="Times New Roman"/>
@@ -16602,9 +16602,6 @@
             <w:vAlign w:val="center"/>
           </w:tcPr>
           <w:p>
-            <w:r>
-              <w:t xml:space="preserve">{{n_18}} </w:t>
-            </w:r>
             <w:pPr>
               <w:spacing w:after="0" w:line="240" w:lineRule="auto"/>
               <w:ind w:left="113" w:right="113"/>
@@ -16615,6 +16612,9 @@
                 <w:bCs/>
               </w:rPr>
             </w:pPr>
+            <w:r>
+              <w:t xml:space="preserve">{{n_18}} </w:t>
+            </w:r>
             <w:r>
               <w:rPr>
                 <w:rFonts w:ascii="Times New Roman" w:eastAsia="Times New Roman" w:hAnsi="Times New Roman" w:cs="Times New Roman"/>
@@ -17837,9 +17837,6 @@
             <w:vAlign w:val="center"/>
           </w:tcPr>
           <w:p>
-            <w:r>
-              <w:t xml:space="preserve">{{c_19}} </w:t>
-            </w:r>
             <w:pPr>
               <w:spacing w:after="0" w:line="240" w:lineRule="auto"/>
               <w:ind w:left="113" w:right="113"/>
@@ -17850,6 +17847,9 @@
                 <w:bCs/>
               </w:rPr>
             </w:pPr>
+            <w:r>
+              <w:t xml:space="preserve">{{c_19}} </w:t>
+            </w:r>
             <w:r>
               <w:rPr>
                 <w:rFonts w:ascii="Times New Roman" w:eastAsia="Times New Roman" w:hAnsi="Times New Roman" w:cs="Times New Roman"/>
@@ -17867,9 +17867,6 @@
             <w:vAlign w:val="center"/>
           </w:tcPr>
           <w:p>
-            <w:r>
-              <w:t xml:space="preserve">{{n_19}} </w:t>
-            </w:r>
             <w:pPr>
               <w:spacing w:after="0" w:line="240" w:lineRule="auto"/>
               <w:ind w:left="113" w:right="113"/>
@@ -17880,6 +17877,9 @@
                 <w:bCs/>
               </w:rPr>
             </w:pPr>
+            <w:r>
+              <w:t xml:space="preserve">{{n_19}} </w:t>
+            </w:r>
             <w:r>
               <w:rPr>
                 <w:rFonts w:ascii="Times New Roman" w:eastAsia="Times New Roman" w:hAnsi="Times New Roman" w:cs="Times New Roman"/>
@@ -18857,9 +18857,6 @@
             <w:vAlign w:val="center"/>
           </w:tcPr>
           <w:p>
-            <w:r>
-              <w:t xml:space="preserve">{{c_20}} </w:t>
-            </w:r>
             <w:pPr>
               <w:spacing w:after="0" w:line="240" w:lineRule="auto"/>
               <w:ind w:left="113" w:right="113"/>
@@ -18870,6 +18867,9 @@
                 <w:bCs/>
               </w:rPr>
             </w:pPr>
+            <w:r>
+              <w:t xml:space="preserve">{{c_20}} </w:t>
+            </w:r>
             <w:r>
               <w:rPr>
                 <w:rFonts w:ascii="Times New Roman" w:eastAsia="Times New Roman" w:hAnsi="Times New Roman" w:cs="Times New Roman"/>
@@ -18887,9 +18887,6 @@
             <w:vAlign w:val="center"/>
           </w:tcPr>
           <w:p>
-            <w:r>
-              <w:t xml:space="preserve">{{n_20}} </w:t>
-            </w:r>
             <w:pPr>
               <w:spacing w:after="0" w:line="240" w:lineRule="auto"/>
               <w:ind w:left="113" w:right="113"/>
@@ -18900,6 +18897,9 @@
                 <w:bCs/>
               </w:rPr>
             </w:pPr>
+            <w:r>
+              <w:t xml:space="preserve">{{n_20}} </w:t>
+            </w:r>
             <w:r>
               <w:rPr>
                 <w:rFonts w:ascii="Times New Roman" w:eastAsia="Times New Roman" w:hAnsi="Times New Roman" w:cs="Times New Roman"/>

</xml_diff>

<commit_message>
Reader Report: mark every numbered part and Introduction row; PDF Introduction
The forms list numbered parts under many specifications (4.a.1 Measurable
student learning outcomes, 4.a.2 Assessment plan, …) and one row per
Introduction item; each is marked on the form. The download marked only the
specification and one rolled-up Introduction box, and the PDF had no
Introduction at all (Lauri).
- add_part_placeholders.py gives every part row and Introduction row its own
  boxes (spec-parts.json: 29/26/26 parts, 20/23/22 intro rows).
- Parts follow their spec's mark unless the reader marks them on their own:
  new per-part boxes on the Reader Report screen (ReaderReport.rows[].parts,
  lead override in leadParts).
- Introduction rows are marked from their own item, with its comment; the
  certification row prints Included Yes/No.
- The PDF now opens with the Introduction and lists each part under its spec.

Co-Authored-By: Claude Opus 5.5 <noreply@anthropic.com>
</commit_message>
<xml_diff>
--- a/CSHSE/server/src/assets/reader-report-templates/associate.docx
+++ b/CSHSE/server/src/assets/reader-report-templates/associate.docx
@@ -289,6 +289,12 @@
               </w:rPr>
               <w:t>Included: Yes/No</w:t>
             </w:r>
+            <w:r>
+              <w:rPr>
+                <w:sz w:val="22"/>
+              </w:rPr>
+              <w:t xml:space="preserve">  {{cert_included}}</w:t>
+            </w:r>
           </w:p>
         </w:tc>
       </w:tr>
@@ -523,6 +529,12 @@
                 <w:rFonts w:ascii="Times New Roman" w:eastAsia="Times New Roman" w:hAnsi="Times New Roman" w:cs="Times New Roman"/>
               </w:rPr>
             </w:pPr>
+            <w:r>
+              <w:rPr>
+                <w:sz w:val="22"/>
+              </w:rPr>
+              <w:t>{{c_introduction_a}}</w:t>
+            </w:r>
           </w:p>
         </w:tc>
         <w:tc>
@@ -536,6 +548,12 @@
                 <w:rFonts w:ascii="Times New Roman" w:eastAsia="Times New Roman" w:hAnsi="Times New Roman" w:cs="Times New Roman"/>
               </w:rPr>
             </w:pPr>
+            <w:r>
+              <w:rPr>
+                <w:sz w:val="22"/>
+              </w:rPr>
+              <w:t>{{n_introduction_a}}</w:t>
+            </w:r>
           </w:p>
         </w:tc>
         <w:tc>
@@ -550,6 +568,12 @@
                 <w:rFonts w:ascii="Times New Roman" w:eastAsia="Times New Roman" w:hAnsi="Times New Roman" w:cs="Times New Roman"/>
               </w:rPr>
             </w:pPr>
+            <w:r>
+              <w:rPr>
+                <w:sz w:val="16"/>
+              </w:rPr>
+              <w:t>{{cm_introduction_a}}</w:t>
+            </w:r>
           </w:p>
         </w:tc>
       </w:tr>
@@ -618,6 +642,12 @@
                 <w:rFonts w:ascii="Times New Roman" w:eastAsia="Times New Roman" w:hAnsi="Times New Roman" w:cs="Times New Roman"/>
               </w:rPr>
             </w:pPr>
+            <w:r>
+              <w:rPr>
+                <w:sz w:val="22"/>
+              </w:rPr>
+              <w:t>{{c_introduction_b}}</w:t>
+            </w:r>
           </w:p>
         </w:tc>
         <w:tc>
@@ -631,6 +661,12 @@
                 <w:rFonts w:ascii="Times New Roman" w:eastAsia="Times New Roman" w:hAnsi="Times New Roman" w:cs="Times New Roman"/>
               </w:rPr>
             </w:pPr>
+            <w:r>
+              <w:rPr>
+                <w:sz w:val="22"/>
+              </w:rPr>
+              <w:t>{{n_introduction_b}}</w:t>
+            </w:r>
           </w:p>
         </w:tc>
         <w:tc>
@@ -645,6 +681,12 @@
                 <w:rFonts w:ascii="Times New Roman" w:eastAsia="Times New Roman" w:hAnsi="Times New Roman" w:cs="Times New Roman"/>
               </w:rPr>
             </w:pPr>
+            <w:r>
+              <w:rPr>
+                <w:sz w:val="16"/>
+              </w:rPr>
+              <w:t>{{cm_introduction_b}}</w:t>
+            </w:r>
           </w:p>
         </w:tc>
       </w:tr>
@@ -705,6 +747,12 @@
                 <w:rFonts w:ascii="Times New Roman" w:eastAsia="Times New Roman" w:hAnsi="Times New Roman" w:cs="Times New Roman"/>
               </w:rPr>
             </w:pPr>
+            <w:r>
+              <w:rPr>
+                <w:sz w:val="22"/>
+              </w:rPr>
+              <w:t>{{c_introduction_c}}</w:t>
+            </w:r>
           </w:p>
         </w:tc>
         <w:tc>
@@ -718,6 +766,12 @@
                 <w:rFonts w:ascii="Times New Roman" w:eastAsia="Times New Roman" w:hAnsi="Times New Roman" w:cs="Times New Roman"/>
               </w:rPr>
             </w:pPr>
+            <w:r>
+              <w:rPr>
+                <w:sz w:val="22"/>
+              </w:rPr>
+              <w:t>{{n_introduction_c}}</w:t>
+            </w:r>
           </w:p>
         </w:tc>
         <w:tc>
@@ -732,6 +786,12 @@
                 <w:rFonts w:ascii="Times New Roman" w:eastAsia="Times New Roman" w:hAnsi="Times New Roman" w:cs="Times New Roman"/>
               </w:rPr>
             </w:pPr>
+            <w:r>
+              <w:rPr>
+                <w:sz w:val="16"/>
+              </w:rPr>
+              <w:t>{{cm_introduction_c}}</w:t>
+            </w:r>
           </w:p>
         </w:tc>
       </w:tr>
@@ -799,6 +859,12 @@
                 <w:rFonts w:ascii="Times New Roman" w:eastAsia="Times New Roman" w:hAnsi="Times New Roman" w:cs="Times New Roman"/>
               </w:rPr>
             </w:pPr>
+            <w:r>
+              <w:rPr>
+                <w:sz w:val="22"/>
+              </w:rPr>
+              <w:t>{{c_introduction_d}}</w:t>
+            </w:r>
           </w:p>
         </w:tc>
         <w:tc>
@@ -812,6 +878,12 @@
                 <w:rFonts w:ascii="Times New Roman" w:eastAsia="Times New Roman" w:hAnsi="Times New Roman" w:cs="Times New Roman"/>
               </w:rPr>
             </w:pPr>
+            <w:r>
+              <w:rPr>
+                <w:sz w:val="22"/>
+              </w:rPr>
+              <w:t>{{n_introduction_d}}</w:t>
+            </w:r>
           </w:p>
         </w:tc>
         <w:tc>
@@ -826,6 +898,12 @@
                 <w:rFonts w:ascii="Times New Roman" w:eastAsia="Times New Roman" w:hAnsi="Times New Roman" w:cs="Times New Roman"/>
               </w:rPr>
             </w:pPr>
+            <w:r>
+              <w:rPr>
+                <w:sz w:val="16"/>
+              </w:rPr>
+              <w:t>{{cm_introduction_d}}</w:t>
+            </w:r>
           </w:p>
         </w:tc>
       </w:tr>
@@ -872,6 +950,12 @@
                 <w:rFonts w:ascii="Times New Roman" w:eastAsia="Times New Roman" w:hAnsi="Times New Roman" w:cs="Times New Roman"/>
               </w:rPr>
             </w:pPr>
+            <w:r>
+              <w:rPr>
+                <w:sz w:val="22"/>
+              </w:rPr>
+              <w:t>{{c_introduction_e}}</w:t>
+            </w:r>
           </w:p>
         </w:tc>
         <w:tc>
@@ -885,6 +969,12 @@
                 <w:rFonts w:ascii="Times New Roman" w:eastAsia="Times New Roman" w:hAnsi="Times New Roman" w:cs="Times New Roman"/>
               </w:rPr>
             </w:pPr>
+            <w:r>
+              <w:rPr>
+                <w:sz w:val="22"/>
+              </w:rPr>
+              <w:t>{{n_introduction_e}}</w:t>
+            </w:r>
           </w:p>
         </w:tc>
         <w:tc>
@@ -899,6 +989,12 @@
                 <w:rFonts w:ascii="Times New Roman" w:eastAsia="Times New Roman" w:hAnsi="Times New Roman" w:cs="Times New Roman"/>
               </w:rPr>
             </w:pPr>
+            <w:r>
+              <w:rPr>
+                <w:sz w:val="16"/>
+              </w:rPr>
+              <w:t>{{cm_introduction_e}}</w:t>
+            </w:r>
           </w:p>
         </w:tc>
       </w:tr>
@@ -945,6 +1041,12 @@
                 <w:rFonts w:ascii="Times New Roman" w:eastAsia="Times New Roman" w:hAnsi="Times New Roman" w:cs="Times New Roman"/>
               </w:rPr>
             </w:pPr>
+            <w:r>
+              <w:rPr>
+                <w:sz w:val="22"/>
+              </w:rPr>
+              <w:t>{{c_introduction_f}}</w:t>
+            </w:r>
           </w:p>
         </w:tc>
         <w:tc>
@@ -958,6 +1060,12 @@
                 <w:rFonts w:ascii="Times New Roman" w:eastAsia="Times New Roman" w:hAnsi="Times New Roman" w:cs="Times New Roman"/>
               </w:rPr>
             </w:pPr>
+            <w:r>
+              <w:rPr>
+                <w:sz w:val="22"/>
+              </w:rPr>
+              <w:t>{{n_introduction_f}}</w:t>
+            </w:r>
           </w:p>
         </w:tc>
         <w:tc>
@@ -972,6 +1080,12 @@
                 <w:rFonts w:ascii="Times New Roman" w:eastAsia="Times New Roman" w:hAnsi="Times New Roman" w:cs="Times New Roman"/>
               </w:rPr>
             </w:pPr>
+            <w:r>
+              <w:rPr>
+                <w:sz w:val="16"/>
+              </w:rPr>
+              <w:t>{{cm_introduction_f}}</w:t>
+            </w:r>
           </w:p>
         </w:tc>
       </w:tr>
@@ -1038,6 +1152,12 @@
                 <w:rFonts w:ascii="Times New Roman" w:eastAsia="Times New Roman" w:hAnsi="Times New Roman" w:cs="Times New Roman"/>
               </w:rPr>
             </w:pPr>
+            <w:r>
+              <w:rPr>
+                <w:sz w:val="22"/>
+              </w:rPr>
+              <w:t>{{c_introduction_g}}</w:t>
+            </w:r>
           </w:p>
         </w:tc>
         <w:tc>
@@ -1051,6 +1171,12 @@
                 <w:rFonts w:ascii="Times New Roman" w:eastAsia="Times New Roman" w:hAnsi="Times New Roman" w:cs="Times New Roman"/>
               </w:rPr>
             </w:pPr>
+            <w:r>
+              <w:rPr>
+                <w:sz w:val="22"/>
+              </w:rPr>
+              <w:t>{{n_introduction_g}}</w:t>
+            </w:r>
           </w:p>
         </w:tc>
         <w:tc>
@@ -1065,6 +1191,12 @@
                 <w:rFonts w:ascii="Times New Roman" w:eastAsia="Times New Roman" w:hAnsi="Times New Roman" w:cs="Times New Roman"/>
               </w:rPr>
             </w:pPr>
+            <w:r>
+              <w:rPr>
+                <w:sz w:val="16"/>
+              </w:rPr>
+              <w:t>{{cm_introduction_g}}</w:t>
+            </w:r>
           </w:p>
         </w:tc>
       </w:tr>
@@ -1111,6 +1243,12 @@
                 <w:rFonts w:ascii="Times New Roman" w:eastAsia="Times New Roman" w:hAnsi="Times New Roman" w:cs="Times New Roman"/>
               </w:rPr>
             </w:pPr>
+            <w:r>
+              <w:rPr>
+                <w:sz w:val="22"/>
+              </w:rPr>
+              <w:t>{{c_introduction_h}}</w:t>
+            </w:r>
           </w:p>
         </w:tc>
         <w:tc>
@@ -1124,6 +1262,12 @@
                 <w:rFonts w:ascii="Times New Roman" w:eastAsia="Times New Roman" w:hAnsi="Times New Roman" w:cs="Times New Roman"/>
               </w:rPr>
             </w:pPr>
+            <w:r>
+              <w:rPr>
+                <w:sz w:val="22"/>
+              </w:rPr>
+              <w:t>{{n_introduction_h}}</w:t>
+            </w:r>
           </w:p>
         </w:tc>
         <w:tc>
@@ -1138,6 +1282,12 @@
                 <w:rFonts w:ascii="Times New Roman" w:eastAsia="Times New Roman" w:hAnsi="Times New Roman" w:cs="Times New Roman"/>
               </w:rPr>
             </w:pPr>
+            <w:r>
+              <w:rPr>
+                <w:sz w:val="16"/>
+              </w:rPr>
+              <w:t>{{cm_introduction_h}}</w:t>
+            </w:r>
           </w:p>
         </w:tc>
       </w:tr>
@@ -1198,6 +1348,12 @@
                 <w:rFonts w:ascii="Times New Roman" w:eastAsia="Times New Roman" w:hAnsi="Times New Roman" w:cs="Times New Roman"/>
               </w:rPr>
             </w:pPr>
+            <w:r>
+              <w:rPr>
+                <w:sz w:val="22"/>
+              </w:rPr>
+              <w:t>{{c_introduction_i}}</w:t>
+            </w:r>
           </w:p>
         </w:tc>
         <w:tc>
@@ -1211,6 +1367,12 @@
                 <w:rFonts w:ascii="Times New Roman" w:eastAsia="Times New Roman" w:hAnsi="Times New Roman" w:cs="Times New Roman"/>
               </w:rPr>
             </w:pPr>
+            <w:r>
+              <w:rPr>
+                <w:sz w:val="22"/>
+              </w:rPr>
+              <w:t>{{n_introduction_i}}</w:t>
+            </w:r>
           </w:p>
         </w:tc>
         <w:tc>
@@ -1225,6 +1387,12 @@
                 <w:rFonts w:ascii="Times New Roman" w:eastAsia="Times New Roman" w:hAnsi="Times New Roman" w:cs="Times New Roman"/>
               </w:rPr>
             </w:pPr>
+            <w:r>
+              <w:rPr>
+                <w:sz w:val="16"/>
+              </w:rPr>
+              <w:t>{{cm_introduction_i}}</w:t>
+            </w:r>
           </w:p>
         </w:tc>
       </w:tr>
@@ -1272,6 +1440,12 @@
                 <w:rFonts w:ascii="Times New Roman" w:eastAsia="Times New Roman" w:hAnsi="Times New Roman" w:cs="Times New Roman"/>
               </w:rPr>
             </w:pPr>
+            <w:r>
+              <w:rPr>
+                <w:sz w:val="22"/>
+              </w:rPr>
+              <w:t>{{c_introduction_j}}</w:t>
+            </w:r>
           </w:p>
         </w:tc>
         <w:tc>
@@ -1285,6 +1459,12 @@
                 <w:rFonts w:ascii="Times New Roman" w:eastAsia="Times New Roman" w:hAnsi="Times New Roman" w:cs="Times New Roman"/>
               </w:rPr>
             </w:pPr>
+            <w:r>
+              <w:rPr>
+                <w:sz w:val="22"/>
+              </w:rPr>
+              <w:t>{{n_introduction_j}}</w:t>
+            </w:r>
           </w:p>
         </w:tc>
         <w:tc>
@@ -1299,6 +1479,12 @@
                 <w:rFonts w:ascii="Times New Roman" w:eastAsia="Times New Roman" w:hAnsi="Times New Roman" w:cs="Times New Roman"/>
               </w:rPr>
             </w:pPr>
+            <w:r>
+              <w:rPr>
+                <w:sz w:val="16"/>
+              </w:rPr>
+              <w:t>{{cm_introduction_j}}</w:t>
+            </w:r>
           </w:p>
         </w:tc>
       </w:tr>
@@ -1384,6 +1570,12 @@
                 <w:rFonts w:ascii="Times New Roman" w:eastAsia="Times New Roman" w:hAnsi="Times New Roman" w:cs="Times New Roman"/>
               </w:rPr>
             </w:pPr>
+            <w:r>
+              <w:rPr>
+                <w:sz w:val="22"/>
+              </w:rPr>
+              <w:t>{{c_introduction_k}}</w:t>
+            </w:r>
           </w:p>
         </w:tc>
         <w:tc>
@@ -1397,6 +1589,12 @@
                 <w:rFonts w:ascii="Times New Roman" w:eastAsia="Times New Roman" w:hAnsi="Times New Roman" w:cs="Times New Roman"/>
               </w:rPr>
             </w:pPr>
+            <w:r>
+              <w:rPr>
+                <w:sz w:val="22"/>
+              </w:rPr>
+              <w:t>{{n_introduction_k}}</w:t>
+            </w:r>
           </w:p>
         </w:tc>
         <w:tc>
@@ -1411,6 +1609,12 @@
                 <w:rFonts w:ascii="Times New Roman" w:eastAsia="Times New Roman" w:hAnsi="Times New Roman" w:cs="Times New Roman"/>
               </w:rPr>
             </w:pPr>
+            <w:r>
+              <w:rPr>
+                <w:sz w:val="16"/>
+              </w:rPr>
+              <w:t>{{cm_introduction_k}}</w:t>
+            </w:r>
           </w:p>
         </w:tc>
       </w:tr>
@@ -1456,6 +1660,12 @@
                 <w:rFonts w:ascii="Times New Roman" w:eastAsia="Times New Roman" w:hAnsi="Times New Roman" w:cs="Times New Roman"/>
               </w:rPr>
             </w:pPr>
+            <w:r>
+              <w:rPr>
+                <w:sz w:val="22"/>
+              </w:rPr>
+              <w:t>{{c_introduction_l}}</w:t>
+            </w:r>
           </w:p>
         </w:tc>
         <w:tc>
@@ -1469,6 +1679,12 @@
                 <w:rFonts w:ascii="Times New Roman" w:eastAsia="Times New Roman" w:hAnsi="Times New Roman" w:cs="Times New Roman"/>
               </w:rPr>
             </w:pPr>
+            <w:r>
+              <w:rPr>
+                <w:sz w:val="22"/>
+              </w:rPr>
+              <w:t>{{n_introduction_l}}</w:t>
+            </w:r>
           </w:p>
         </w:tc>
         <w:tc>
@@ -1483,6 +1699,12 @@
                 <w:rFonts w:ascii="Times New Roman" w:eastAsia="Times New Roman" w:hAnsi="Times New Roman" w:cs="Times New Roman"/>
               </w:rPr>
             </w:pPr>
+            <w:r>
+              <w:rPr>
+                <w:sz w:val="16"/>
+              </w:rPr>
+              <w:t>{{cm_introduction_l}}</w:t>
+            </w:r>
           </w:p>
         </w:tc>
       </w:tr>
@@ -1528,6 +1750,12 @@
                 <w:rFonts w:ascii="Times New Roman" w:eastAsia="Times New Roman" w:hAnsi="Times New Roman" w:cs="Times New Roman"/>
               </w:rPr>
             </w:pPr>
+            <w:r>
+              <w:rPr>
+                <w:sz w:val="22"/>
+              </w:rPr>
+              <w:t>{{c_introduction_m}}</w:t>
+            </w:r>
           </w:p>
         </w:tc>
         <w:tc>
@@ -1541,6 +1769,12 @@
                 <w:rFonts w:ascii="Times New Roman" w:eastAsia="Times New Roman" w:hAnsi="Times New Roman" w:cs="Times New Roman"/>
               </w:rPr>
             </w:pPr>
+            <w:r>
+              <w:rPr>
+                <w:sz w:val="22"/>
+              </w:rPr>
+              <w:t>{{n_introduction_m}}</w:t>
+            </w:r>
           </w:p>
         </w:tc>
         <w:tc>
@@ -1555,6 +1789,12 @@
                 <w:rFonts w:ascii="Times New Roman" w:eastAsia="Times New Roman" w:hAnsi="Times New Roman" w:cs="Times New Roman"/>
               </w:rPr>
             </w:pPr>
+            <w:r>
+              <w:rPr>
+                <w:sz w:val="16"/>
+              </w:rPr>
+              <w:t>{{cm_introduction_m}}</w:t>
+            </w:r>
           </w:p>
         </w:tc>
       </w:tr>
@@ -1601,6 +1841,12 @@
                 <w:rFonts w:ascii="Times New Roman" w:eastAsia="Times New Roman" w:hAnsi="Times New Roman" w:cs="Times New Roman"/>
               </w:rPr>
             </w:pPr>
+            <w:r>
+              <w:rPr>
+                <w:sz w:val="22"/>
+              </w:rPr>
+              <w:t>{{c_introduction_n}}</w:t>
+            </w:r>
           </w:p>
         </w:tc>
         <w:tc>
@@ -1614,6 +1860,12 @@
                 <w:rFonts w:ascii="Times New Roman" w:eastAsia="Times New Roman" w:hAnsi="Times New Roman" w:cs="Times New Roman"/>
               </w:rPr>
             </w:pPr>
+            <w:r>
+              <w:rPr>
+                <w:sz w:val="22"/>
+              </w:rPr>
+              <w:t>{{n_introduction_n}}</w:t>
+            </w:r>
           </w:p>
         </w:tc>
         <w:tc>
@@ -1628,6 +1880,12 @@
                 <w:rFonts w:ascii="Times New Roman" w:eastAsia="Times New Roman" w:hAnsi="Times New Roman" w:cs="Times New Roman"/>
               </w:rPr>
             </w:pPr>
+            <w:r>
+              <w:rPr>
+                <w:sz w:val="16"/>
+              </w:rPr>
+              <w:t>{{cm_introduction_n}}</w:t>
+            </w:r>
           </w:p>
         </w:tc>
       </w:tr>
@@ -1716,6 +1974,12 @@
                 <w:rFonts w:ascii="Times New Roman" w:eastAsia="Times New Roman" w:hAnsi="Times New Roman" w:cs="Times New Roman"/>
               </w:rPr>
             </w:pPr>
+            <w:r>
+              <w:rPr>
+                <w:sz w:val="22"/>
+              </w:rPr>
+              <w:t>{{c_introduction_o}}</w:t>
+            </w:r>
           </w:p>
         </w:tc>
         <w:tc>
@@ -1729,6 +1993,12 @@
                 <w:rFonts w:ascii="Times New Roman" w:eastAsia="Times New Roman" w:hAnsi="Times New Roman" w:cs="Times New Roman"/>
               </w:rPr>
             </w:pPr>
+            <w:r>
+              <w:rPr>
+                <w:sz w:val="22"/>
+              </w:rPr>
+              <w:t>{{n_introduction_o}}</w:t>
+            </w:r>
           </w:p>
         </w:tc>
         <w:tc>
@@ -1743,6 +2013,12 @@
                 <w:rFonts w:ascii="Times New Roman" w:eastAsia="Times New Roman" w:hAnsi="Times New Roman" w:cs="Times New Roman"/>
               </w:rPr>
             </w:pPr>
+            <w:r>
+              <w:rPr>
+                <w:sz w:val="16"/>
+              </w:rPr>
+              <w:t>{{cm_introduction_o}}</w:t>
+            </w:r>
           </w:p>
         </w:tc>
       </w:tr>
@@ -2052,6 +2328,12 @@
                 <w:rFonts w:ascii="Times New Roman" w:eastAsia="Times New Roman" w:hAnsi="Times New Roman" w:cs="Times New Roman"/>
               </w:rPr>
             </w:pPr>
+            <w:r>
+              <w:rPr>
+                <w:sz w:val="22"/>
+              </w:rPr>
+              <w:t>{{c_introduction_o}}</w:t>
+            </w:r>
           </w:p>
         </w:tc>
         <w:tc>
@@ -2065,6 +2347,12 @@
                 <w:rFonts w:ascii="Times New Roman" w:eastAsia="Times New Roman" w:hAnsi="Times New Roman" w:cs="Times New Roman"/>
               </w:rPr>
             </w:pPr>
+            <w:r>
+              <w:rPr>
+                <w:sz w:val="22"/>
+              </w:rPr>
+              <w:t>{{n_introduction_o}}</w:t>
+            </w:r>
           </w:p>
         </w:tc>
         <w:tc>
@@ -2181,6 +2469,12 @@
                 <w:rFonts w:ascii="Times New Roman" w:eastAsia="Times New Roman" w:hAnsi="Times New Roman" w:cs="Times New Roman"/>
               </w:rPr>
             </w:pPr>
+            <w:r>
+              <w:rPr>
+                <w:sz w:val="22"/>
+              </w:rPr>
+              <w:t>{{c_introduction_p}}</w:t>
+            </w:r>
           </w:p>
         </w:tc>
         <w:tc>
@@ -2194,6 +2488,12 @@
                 <w:rFonts w:ascii="Times New Roman" w:eastAsia="Times New Roman" w:hAnsi="Times New Roman" w:cs="Times New Roman"/>
               </w:rPr>
             </w:pPr>
+            <w:r>
+              <w:rPr>
+                <w:sz w:val="22"/>
+              </w:rPr>
+              <w:t>{{n_introduction_p}}</w:t>
+            </w:r>
           </w:p>
         </w:tc>
         <w:tc>
@@ -2208,6 +2508,12 @@
                 <w:rFonts w:ascii="Times New Roman" w:eastAsia="Times New Roman" w:hAnsi="Times New Roman" w:cs="Times New Roman"/>
               </w:rPr>
             </w:pPr>
+            <w:r>
+              <w:rPr>
+                <w:sz w:val="16"/>
+              </w:rPr>
+              <w:t>{{cm_introduction_p}}</w:t>
+            </w:r>
           </w:p>
         </w:tc>
       </w:tr>
@@ -2326,6 +2632,12 @@
                 <w:rFonts w:ascii="Times New Roman" w:eastAsia="Times New Roman" w:hAnsi="Times New Roman" w:cs="Times New Roman"/>
               </w:rPr>
             </w:pPr>
+            <w:r>
+              <w:rPr>
+                <w:sz w:val="22"/>
+              </w:rPr>
+              <w:t>{{c_introduction_q}}</w:t>
+            </w:r>
           </w:p>
         </w:tc>
         <w:tc>
@@ -2339,6 +2651,12 @@
                 <w:rFonts w:ascii="Times New Roman" w:eastAsia="Times New Roman" w:hAnsi="Times New Roman" w:cs="Times New Roman"/>
               </w:rPr>
             </w:pPr>
+            <w:r>
+              <w:rPr>
+                <w:sz w:val="22"/>
+              </w:rPr>
+              <w:t>{{n_introduction_q}}</w:t>
+            </w:r>
           </w:p>
         </w:tc>
         <w:tc>
@@ -2353,6 +2671,12 @@
                 <w:rFonts w:ascii="Times New Roman" w:eastAsia="Times New Roman" w:hAnsi="Times New Roman" w:cs="Times New Roman"/>
               </w:rPr>
             </w:pPr>
+            <w:r>
+              <w:rPr>
+                <w:sz w:val="16"/>
+              </w:rPr>
+              <w:t>{{cm_introduction_q}}</w:t>
+            </w:r>
           </w:p>
         </w:tc>
       </w:tr>
@@ -2395,6 +2719,12 @@
                 <w:rFonts w:ascii="Times New Roman" w:eastAsia="Times New Roman" w:hAnsi="Times New Roman" w:cs="Times New Roman"/>
               </w:rPr>
             </w:pPr>
+            <w:r>
+              <w:rPr>
+                <w:sz w:val="22"/>
+              </w:rPr>
+              <w:t>{{c_introduction_r}}</w:t>
+            </w:r>
           </w:p>
         </w:tc>
         <w:tc>
@@ -2408,6 +2738,12 @@
                 <w:rFonts w:ascii="Times New Roman" w:eastAsia="Times New Roman" w:hAnsi="Times New Roman" w:cs="Times New Roman"/>
               </w:rPr>
             </w:pPr>
+            <w:r>
+              <w:rPr>
+                <w:sz w:val="22"/>
+              </w:rPr>
+              <w:t>{{n_introduction_r}}</w:t>
+            </w:r>
           </w:p>
         </w:tc>
         <w:tc>
@@ -2422,6 +2758,12 @@
                 <w:rFonts w:ascii="Times New Roman" w:eastAsia="Times New Roman" w:hAnsi="Times New Roman" w:cs="Times New Roman"/>
               </w:rPr>
             </w:pPr>
+            <w:r>
+              <w:rPr>
+                <w:sz w:val="16"/>
+              </w:rPr>
+              <w:t>{{cm_introduction_r}}</w:t>
+            </w:r>
           </w:p>
         </w:tc>
       </w:tr>
@@ -4517,6 +4859,12 @@
                 <w:rFonts w:ascii="Times New Roman" w:eastAsia="Times New Roman" w:hAnsi="Times New Roman" w:cs="Times New Roman"/>
               </w:rPr>
             </w:pPr>
+            <w:r>
+              <w:rPr>
+                <w:sz w:val="22"/>
+              </w:rPr>
+              <w:t>{{c_3_b_p1}}</w:t>
+            </w:r>
           </w:p>
         </w:tc>
         <w:tc>
@@ -4530,6 +4878,12 @@
                 <w:rFonts w:ascii="Times New Roman" w:eastAsia="Times New Roman" w:hAnsi="Times New Roman" w:cs="Times New Roman"/>
               </w:rPr>
             </w:pPr>
+            <w:r>
+              <w:rPr>
+                <w:sz w:val="22"/>
+              </w:rPr>
+              <w:t>{{n_3_b_p1}}</w:t>
+            </w:r>
           </w:p>
         </w:tc>
         <w:tc>
@@ -4605,6 +4959,12 @@
                 <w:rFonts w:ascii="Times New Roman" w:eastAsia="Times New Roman" w:hAnsi="Times New Roman" w:cs="Times New Roman"/>
               </w:rPr>
             </w:pPr>
+            <w:r>
+              <w:rPr>
+                <w:sz w:val="22"/>
+              </w:rPr>
+              <w:t>{{c_3_b_p2}}</w:t>
+            </w:r>
           </w:p>
         </w:tc>
         <w:tc>
@@ -4618,6 +4978,12 @@
                 <w:rFonts w:ascii="Times New Roman" w:eastAsia="Times New Roman" w:hAnsi="Times New Roman" w:cs="Times New Roman"/>
               </w:rPr>
             </w:pPr>
+            <w:r>
+              <w:rPr>
+                <w:sz w:val="22"/>
+              </w:rPr>
+              <w:t>{{n_3_b_p2}}</w:t>
+            </w:r>
           </w:p>
         </w:tc>
         <w:tc>
@@ -4693,6 +5059,12 @@
                 <w:rFonts w:ascii="Times New Roman" w:eastAsia="Times New Roman" w:hAnsi="Times New Roman" w:cs="Times New Roman"/>
               </w:rPr>
             </w:pPr>
+            <w:r>
+              <w:rPr>
+                <w:sz w:val="22"/>
+              </w:rPr>
+              <w:t>{{c_3_b_p3}}</w:t>
+            </w:r>
           </w:p>
         </w:tc>
         <w:tc>
@@ -4706,6 +5078,12 @@
                 <w:rFonts w:ascii="Times New Roman" w:eastAsia="Times New Roman" w:hAnsi="Times New Roman" w:cs="Times New Roman"/>
               </w:rPr>
             </w:pPr>
+            <w:r>
+              <w:rPr>
+                <w:sz w:val="22"/>
+              </w:rPr>
+              <w:t>{{n_3_b_p3}}</w:t>
+            </w:r>
           </w:p>
         </w:tc>
         <w:tc>
@@ -5280,6 +5658,12 @@
                 <w:rFonts w:ascii="Times New Roman" w:eastAsia="Times New Roman" w:hAnsi="Times New Roman" w:cs="Times New Roman"/>
               </w:rPr>
             </w:pPr>
+            <w:r>
+              <w:rPr>
+                <w:sz w:val="22"/>
+              </w:rPr>
+              <w:t>{{c_4_a_p1}}</w:t>
+            </w:r>
           </w:p>
         </w:tc>
         <w:tc>
@@ -5293,6 +5677,12 @@
                 <w:rFonts w:ascii="Times New Roman" w:eastAsia="Times New Roman" w:hAnsi="Times New Roman" w:cs="Times New Roman"/>
               </w:rPr>
             </w:pPr>
+            <w:r>
+              <w:rPr>
+                <w:sz w:val="22"/>
+              </w:rPr>
+              <w:t>{{n_4_a_p1}}</w:t>
+            </w:r>
           </w:p>
         </w:tc>
         <w:tc>
@@ -5354,6 +5744,12 @@
                 <w:rFonts w:ascii="Times New Roman" w:eastAsia="Times New Roman" w:hAnsi="Times New Roman" w:cs="Times New Roman"/>
               </w:rPr>
             </w:pPr>
+            <w:r>
+              <w:rPr>
+                <w:sz w:val="22"/>
+              </w:rPr>
+              <w:t>{{c_4_a_p2}}</w:t>
+            </w:r>
           </w:p>
         </w:tc>
         <w:tc>
@@ -5367,6 +5763,12 @@
                 <w:rFonts w:ascii="Times New Roman" w:eastAsia="Times New Roman" w:hAnsi="Times New Roman" w:cs="Times New Roman"/>
               </w:rPr>
             </w:pPr>
+            <w:r>
+              <w:rPr>
+                <w:sz w:val="22"/>
+              </w:rPr>
+              <w:t>{{n_4_a_p2}}</w:t>
+            </w:r>
           </w:p>
         </w:tc>
         <w:tc>
@@ -5428,6 +5830,12 @@
                 <w:rFonts w:ascii="Times New Roman" w:eastAsia="Times New Roman" w:hAnsi="Times New Roman" w:cs="Times New Roman"/>
               </w:rPr>
             </w:pPr>
+            <w:r>
+              <w:rPr>
+                <w:sz w:val="22"/>
+              </w:rPr>
+              <w:t>{{c_4_a_p3}}</w:t>
+            </w:r>
           </w:p>
         </w:tc>
         <w:tc>
@@ -5441,6 +5849,12 @@
                 <w:rFonts w:ascii="Times New Roman" w:eastAsia="Times New Roman" w:hAnsi="Times New Roman" w:cs="Times New Roman"/>
               </w:rPr>
             </w:pPr>
+            <w:r>
+              <w:rPr>
+                <w:sz w:val="22"/>
+              </w:rPr>
+              <w:t>{{n_4_a_p3}}</w:t>
+            </w:r>
           </w:p>
         </w:tc>
         <w:tc>
@@ -5502,6 +5916,12 @@
                 <w:rFonts w:ascii="Times New Roman" w:eastAsia="Times New Roman" w:hAnsi="Times New Roman" w:cs="Times New Roman"/>
               </w:rPr>
             </w:pPr>
+            <w:r>
+              <w:rPr>
+                <w:sz w:val="22"/>
+              </w:rPr>
+              <w:t>{{c_4_a_p4}}</w:t>
+            </w:r>
           </w:p>
         </w:tc>
         <w:tc>
@@ -5515,6 +5935,12 @@
                 <w:rFonts w:ascii="Times New Roman" w:eastAsia="Times New Roman" w:hAnsi="Times New Roman" w:cs="Times New Roman"/>
               </w:rPr>
             </w:pPr>
+            <w:r>
+              <w:rPr>
+                <w:sz w:val="22"/>
+              </w:rPr>
+              <w:t>{{n_4_a_p4}}</w:t>
+            </w:r>
           </w:p>
         </w:tc>
         <w:tc>
@@ -5685,6 +6111,12 @@
                 <w:rFonts w:ascii="Times New Roman" w:eastAsia="Times New Roman" w:hAnsi="Times New Roman" w:cs="Times New Roman"/>
               </w:rPr>
             </w:pPr>
+            <w:r>
+              <w:rPr>
+                <w:sz w:val="22"/>
+              </w:rPr>
+              <w:t>{{c_4_b_p1}}</w:t>
+            </w:r>
           </w:p>
         </w:tc>
         <w:tc>
@@ -5698,6 +6130,12 @@
                 <w:rFonts w:ascii="Times New Roman" w:eastAsia="Times New Roman" w:hAnsi="Times New Roman" w:cs="Times New Roman"/>
               </w:rPr>
             </w:pPr>
+            <w:r>
+              <w:rPr>
+                <w:sz w:val="22"/>
+              </w:rPr>
+              <w:t>{{n_4_b_p1}}</w:t>
+            </w:r>
           </w:p>
         </w:tc>
         <w:tc>
@@ -5759,6 +6197,12 @@
                 <w:rFonts w:ascii="Times New Roman" w:eastAsia="Times New Roman" w:hAnsi="Times New Roman" w:cs="Times New Roman"/>
               </w:rPr>
             </w:pPr>
+            <w:r>
+              <w:rPr>
+                <w:sz w:val="22"/>
+              </w:rPr>
+              <w:t>{{c_4_b_p2}}</w:t>
+            </w:r>
           </w:p>
         </w:tc>
         <w:tc>
@@ -5772,6 +6216,12 @@
                 <w:rFonts w:ascii="Times New Roman" w:eastAsia="Times New Roman" w:hAnsi="Times New Roman" w:cs="Times New Roman"/>
               </w:rPr>
             </w:pPr>
+            <w:r>
+              <w:rPr>
+                <w:sz w:val="22"/>
+              </w:rPr>
+              <w:t>{{n_4_b_p2}}</w:t>
+            </w:r>
           </w:p>
         </w:tc>
         <w:tc>
@@ -5833,6 +6283,12 @@
                 <w:rFonts w:ascii="Times New Roman" w:eastAsia="Times New Roman" w:hAnsi="Times New Roman" w:cs="Times New Roman"/>
               </w:rPr>
             </w:pPr>
+            <w:r>
+              <w:rPr>
+                <w:sz w:val="22"/>
+              </w:rPr>
+              <w:t>{{c_4_b_p3}}</w:t>
+            </w:r>
           </w:p>
         </w:tc>
         <w:tc>
@@ -5846,6 +6302,12 @@
                 <w:rFonts w:ascii="Times New Roman" w:eastAsia="Times New Roman" w:hAnsi="Times New Roman" w:cs="Times New Roman"/>
               </w:rPr>
             </w:pPr>
+            <w:r>
+              <w:rPr>
+                <w:sz w:val="22"/>
+              </w:rPr>
+              <w:t>{{n_4_b_p3}}</w:t>
+            </w:r>
           </w:p>
         </w:tc>
         <w:tc>
@@ -5908,6 +6370,12 @@
                 <w:rFonts w:ascii="Times New Roman" w:eastAsia="Times New Roman" w:hAnsi="Times New Roman" w:cs="Times New Roman"/>
               </w:rPr>
             </w:pPr>
+            <w:r>
+              <w:rPr>
+                <w:sz w:val="22"/>
+              </w:rPr>
+              <w:t>{{c_4_b_p4}}</w:t>
+            </w:r>
           </w:p>
         </w:tc>
         <w:tc>
@@ -5921,6 +6389,12 @@
                 <w:rFonts w:ascii="Times New Roman" w:eastAsia="Times New Roman" w:hAnsi="Times New Roman" w:cs="Times New Roman"/>
               </w:rPr>
             </w:pPr>
+            <w:r>
+              <w:rPr>
+                <w:sz w:val="22"/>
+              </w:rPr>
+              <w:t>{{n_4_b_p4}}</w:t>
+            </w:r>
           </w:p>
         </w:tc>
         <w:tc>
@@ -6136,6 +6610,12 @@
                 <w:rFonts w:ascii="Times New Roman" w:eastAsia="Times New Roman" w:hAnsi="Times New Roman" w:cs="Times New Roman"/>
               </w:rPr>
             </w:pPr>
+            <w:r>
+              <w:rPr>
+                <w:sz w:val="22"/>
+              </w:rPr>
+              <w:t>{{c_4_c_p1}}</w:t>
+            </w:r>
           </w:p>
         </w:tc>
         <w:tc>
@@ -6149,6 +6629,12 @@
                 <w:rFonts w:ascii="Times New Roman" w:eastAsia="Times New Roman" w:hAnsi="Times New Roman" w:cs="Times New Roman"/>
               </w:rPr>
             </w:pPr>
+            <w:r>
+              <w:rPr>
+                <w:sz w:val="22"/>
+              </w:rPr>
+              <w:t>{{n_4_c_p1}}</w:t>
+            </w:r>
           </w:p>
         </w:tc>
         <w:tc>
@@ -6211,6 +6697,12 @@
                 <w:rFonts w:ascii="Times New Roman" w:eastAsia="Times New Roman" w:hAnsi="Times New Roman" w:cs="Times New Roman"/>
               </w:rPr>
             </w:pPr>
+            <w:r>
+              <w:rPr>
+                <w:sz w:val="22"/>
+              </w:rPr>
+              <w:t>{{c_4_c_p2}}</w:t>
+            </w:r>
           </w:p>
         </w:tc>
         <w:tc>
@@ -6224,6 +6716,12 @@
                 <w:rFonts w:ascii="Times New Roman" w:eastAsia="Times New Roman" w:hAnsi="Times New Roman" w:cs="Times New Roman"/>
               </w:rPr>
             </w:pPr>
+            <w:r>
+              <w:rPr>
+                <w:sz w:val="22"/>
+              </w:rPr>
+              <w:t>{{n_4_c_p2}}</w:t>
+            </w:r>
           </w:p>
         </w:tc>
         <w:tc>
@@ -7226,6 +7724,12 @@
                 <w:rFonts w:ascii="Times New Roman" w:eastAsia="Times New Roman" w:hAnsi="Times New Roman" w:cs="Times New Roman"/>
               </w:rPr>
             </w:pPr>
+            <w:r>
+              <w:rPr>
+                <w:sz w:val="22"/>
+              </w:rPr>
+              <w:t>{{c_6_a_p1}}</w:t>
+            </w:r>
           </w:p>
         </w:tc>
         <w:tc>
@@ -7239,6 +7743,12 @@
                 <w:rFonts w:ascii="Times New Roman" w:eastAsia="Times New Roman" w:hAnsi="Times New Roman" w:cs="Times New Roman"/>
               </w:rPr>
             </w:pPr>
+            <w:r>
+              <w:rPr>
+                <w:sz w:val="22"/>
+              </w:rPr>
+              <w:t>{{n_6_a_p1}}</w:t>
+            </w:r>
           </w:p>
         </w:tc>
         <w:tc>
@@ -7313,6 +7823,12 @@
                 <w:rFonts w:ascii="Times New Roman" w:eastAsia="Times New Roman" w:hAnsi="Times New Roman" w:cs="Times New Roman"/>
               </w:rPr>
             </w:pPr>
+            <w:r>
+              <w:rPr>
+                <w:sz w:val="22"/>
+              </w:rPr>
+              <w:t>{{c_6_a_p2}}</w:t>
+            </w:r>
           </w:p>
         </w:tc>
         <w:tc>
@@ -7326,6 +7842,12 @@
                 <w:rFonts w:ascii="Times New Roman" w:eastAsia="Times New Roman" w:hAnsi="Times New Roman" w:cs="Times New Roman"/>
               </w:rPr>
             </w:pPr>
+            <w:r>
+              <w:rPr>
+                <w:sz w:val="22"/>
+              </w:rPr>
+              <w:t>{{n_6_a_p2}}</w:t>
+            </w:r>
           </w:p>
         </w:tc>
         <w:tc>
@@ -7803,6 +8325,12 @@
                 <w:rFonts w:ascii="Times New Roman" w:eastAsia="Times New Roman" w:hAnsi="Times New Roman" w:cs="Times New Roman"/>
               </w:rPr>
             </w:pPr>
+            <w:r>
+              <w:rPr>
+                <w:sz w:val="22"/>
+              </w:rPr>
+              <w:t>{{c_7_b_p1}}</w:t>
+            </w:r>
           </w:p>
         </w:tc>
         <w:tc>
@@ -7816,6 +8344,12 @@
                 <w:rFonts w:ascii="Times New Roman" w:eastAsia="Times New Roman" w:hAnsi="Times New Roman" w:cs="Times New Roman"/>
               </w:rPr>
             </w:pPr>
+            <w:r>
+              <w:rPr>
+                <w:sz w:val="22"/>
+              </w:rPr>
+              <w:t>{{n_7_b_p1}}</w:t>
+            </w:r>
           </w:p>
         </w:tc>
         <w:tc>
@@ -7875,6 +8409,12 @@
                 <w:rFonts w:ascii="Times New Roman" w:eastAsia="Times New Roman" w:hAnsi="Times New Roman" w:cs="Times New Roman"/>
               </w:rPr>
             </w:pPr>
+            <w:r>
+              <w:rPr>
+                <w:sz w:val="22"/>
+              </w:rPr>
+              <w:t>{{c_7_b_p2}}</w:t>
+            </w:r>
           </w:p>
         </w:tc>
         <w:tc>
@@ -7888,6 +8428,12 @@
                 <w:rFonts w:ascii="Times New Roman" w:eastAsia="Times New Roman" w:hAnsi="Times New Roman" w:cs="Times New Roman"/>
               </w:rPr>
             </w:pPr>
+            <w:r>
+              <w:rPr>
+                <w:sz w:val="22"/>
+              </w:rPr>
+              <w:t>{{n_7_b_p2}}</w:t>
+            </w:r>
           </w:p>
         </w:tc>
         <w:tc>
@@ -8647,6 +9193,12 @@
                 <w:rFonts w:ascii="Times New Roman" w:eastAsia="Times New Roman" w:hAnsi="Times New Roman" w:cs="Times New Roman"/>
               </w:rPr>
             </w:pPr>
+            <w:r>
+              <w:rPr>
+                <w:sz w:val="22"/>
+              </w:rPr>
+              <w:t>{{c_8_a_p1}}</w:t>
+            </w:r>
           </w:p>
         </w:tc>
         <w:tc>
@@ -8660,6 +9212,12 @@
                 <w:rFonts w:ascii="Times New Roman" w:eastAsia="Times New Roman" w:hAnsi="Times New Roman" w:cs="Times New Roman"/>
               </w:rPr>
             </w:pPr>
+            <w:r>
+              <w:rPr>
+                <w:sz w:val="22"/>
+              </w:rPr>
+              <w:t>{{n_8_a_p1}}</w:t>
+            </w:r>
           </w:p>
         </w:tc>
         <w:tc>
@@ -8891,6 +9449,12 @@
                 <w:rFonts w:ascii="Times New Roman" w:eastAsia="Times New Roman" w:hAnsi="Times New Roman" w:cs="Times New Roman"/>
               </w:rPr>
             </w:pPr>
+            <w:r>
+              <w:rPr>
+                <w:sz w:val="22"/>
+              </w:rPr>
+              <w:t>{{c_8_b_p1}}</w:t>
+            </w:r>
           </w:p>
         </w:tc>
         <w:tc>
@@ -8904,6 +9468,12 @@
                 <w:rFonts w:ascii="Times New Roman" w:eastAsia="Times New Roman" w:hAnsi="Times New Roman" w:cs="Times New Roman"/>
               </w:rPr>
             </w:pPr>
+            <w:r>
+              <w:rPr>
+                <w:sz w:val="22"/>
+              </w:rPr>
+              <w:t>{{n_8_b_p1}}</w:t>
+            </w:r>
           </w:p>
         </w:tc>
         <w:tc>
@@ -11631,6 +12201,12 @@
                 <w:bCs/>
               </w:rPr>
             </w:pPr>
+            <w:r>
+              <w:rPr>
+                <w:sz w:val="22"/>
+              </w:rPr>
+              <w:t>{{c_12_b_p1}}</w:t>
+            </w:r>
           </w:p>
         </w:tc>
         <w:tc>
@@ -11645,6 +12221,12 @@
                 <w:bCs/>
               </w:rPr>
             </w:pPr>
+            <w:r>
+              <w:rPr>
+                <w:sz w:val="22"/>
+              </w:rPr>
+              <w:t>{{n_12_b_p1}}</w:t>
+            </w:r>
           </w:p>
         </w:tc>
         <w:tc>
@@ -11721,6 +12303,12 @@
                 <w:bCs/>
               </w:rPr>
             </w:pPr>
+            <w:r>
+              <w:rPr>
+                <w:sz w:val="22"/>
+              </w:rPr>
+              <w:t>{{c_12_b_p2}}</w:t>
+            </w:r>
           </w:p>
         </w:tc>
         <w:tc>
@@ -11735,6 +12323,12 @@
                 <w:bCs/>
               </w:rPr>
             </w:pPr>
+            <w:r>
+              <w:rPr>
+                <w:sz w:val="22"/>
+              </w:rPr>
+              <w:t>{{n_12_b_p2}}</w:t>
+            </w:r>
           </w:p>
         </w:tc>
         <w:tc>
@@ -15109,6 +15703,12 @@
                 <w:bCs/>
               </w:rPr>
             </w:pPr>
+            <w:r>
+              <w:rPr>
+                <w:sz w:val="22"/>
+              </w:rPr>
+              <w:t>{{c_16_c_p1}}</w:t>
+            </w:r>
           </w:p>
         </w:tc>
         <w:tc>
@@ -15123,6 +15723,12 @@
                 <w:bCs/>
               </w:rPr>
             </w:pPr>
+            <w:r>
+              <w:rPr>
+                <w:sz w:val="22"/>
+              </w:rPr>
+              <w:t>{{n_16_c_p1}}</w:t>
+            </w:r>
           </w:p>
         </w:tc>
         <w:tc>
@@ -15202,6 +15808,12 @@
                 <w:bCs/>
               </w:rPr>
             </w:pPr>
+            <w:r>
+              <w:rPr>
+                <w:sz w:val="22"/>
+              </w:rPr>
+              <w:t>{{c_16_c_p2}}</w:t>
+            </w:r>
           </w:p>
         </w:tc>
         <w:tc>
@@ -15216,6 +15828,12 @@
                 <w:bCs/>
               </w:rPr>
             </w:pPr>
+            <w:r>
+              <w:rPr>
+                <w:sz w:val="22"/>
+              </w:rPr>
+              <w:t>{{n_16_c_p2}}</w:t>
+            </w:r>
           </w:p>
         </w:tc>
         <w:tc>
@@ -15295,6 +15913,12 @@
                 <w:bCs/>
               </w:rPr>
             </w:pPr>
+            <w:r>
+              <w:rPr>
+                <w:sz w:val="22"/>
+              </w:rPr>
+              <w:t>{{c_16_c_p3}}</w:t>
+            </w:r>
           </w:p>
         </w:tc>
         <w:tc>
@@ -15309,6 +15933,12 @@
                 <w:bCs/>
               </w:rPr>
             </w:pPr>
+            <w:r>
+              <w:rPr>
+                <w:sz w:val="22"/>
+              </w:rPr>
+              <w:t>{{n_16_c_p3}}</w:t>
+            </w:r>
           </w:p>
         </w:tc>
         <w:tc>
@@ -15388,6 +16018,12 @@
                 <w:bCs/>
               </w:rPr>
             </w:pPr>
+            <w:r>
+              <w:rPr>
+                <w:sz w:val="22"/>
+              </w:rPr>
+              <w:t>{{c_16_c_p4}}</w:t>
+            </w:r>
           </w:p>
         </w:tc>
         <w:tc>
@@ -15402,6 +16038,12 @@
                 <w:bCs/>
               </w:rPr>
             </w:pPr>
+            <w:r>
+              <w:rPr>
+                <w:sz w:val="22"/>
+              </w:rPr>
+              <w:t>{{n_16_c_p4}}</w:t>
+            </w:r>
           </w:p>
         </w:tc>
         <w:tc>
@@ -15479,6 +16121,12 @@
                 <w:bCs/>
               </w:rPr>
             </w:pPr>
+            <w:r>
+              <w:rPr>
+                <w:sz w:val="22"/>
+              </w:rPr>
+              <w:t>{{c_16_c_p5}}</w:t>
+            </w:r>
           </w:p>
         </w:tc>
         <w:tc>
@@ -15493,6 +16141,12 @@
                 <w:bCs/>
               </w:rPr>
             </w:pPr>
+            <w:r>
+              <w:rPr>
+                <w:sz w:val="22"/>
+              </w:rPr>
+              <w:t>{{n_16_c_p5}}</w:t>
+            </w:r>
           </w:p>
         </w:tc>
         <w:tc>
@@ -15571,6 +16225,12 @@
                 <w:bCs/>
               </w:rPr>
             </w:pPr>
+            <w:r>
+              <w:rPr>
+                <w:sz w:val="22"/>
+              </w:rPr>
+              <w:t>{{c_16_c_p6}}</w:t>
+            </w:r>
           </w:p>
         </w:tc>
         <w:tc>
@@ -15585,6 +16245,12 @@
                 <w:bCs/>
               </w:rPr>
             </w:pPr>
+            <w:r>
+              <w:rPr>
+                <w:sz w:val="22"/>
+              </w:rPr>
+              <w:t>{{n_16_c_p6}}</w:t>
+            </w:r>
           </w:p>
         </w:tc>
         <w:tc>
@@ -19847,6 +20513,12 @@
                 <w:bCs/>
               </w:rPr>
             </w:pPr>
+            <w:r>
+              <w:rPr>
+                <w:sz w:val="22"/>
+              </w:rPr>
+              <w:t>{{c_20_h_p1}}</w:t>
+            </w:r>
           </w:p>
         </w:tc>
         <w:tc>
@@ -19861,6 +20533,12 @@
                 <w:bCs/>
               </w:rPr>
             </w:pPr>
+            <w:r>
+              <w:rPr>
+                <w:sz w:val="22"/>
+              </w:rPr>
+              <w:t>{{n_20_h_p1}}</w:t>
+            </w:r>
           </w:p>
         </w:tc>
         <w:tc>
@@ -19922,6 +20600,12 @@
                 <w:bCs/>
               </w:rPr>
             </w:pPr>
+            <w:r>
+              <w:rPr>
+                <w:sz w:val="22"/>
+              </w:rPr>
+              <w:t>{{c_20_h_p2}}</w:t>
+            </w:r>
           </w:p>
         </w:tc>
         <w:tc>
@@ -19936,6 +20620,12 @@
                 <w:bCs/>
               </w:rPr>
             </w:pPr>
+            <w:r>
+              <w:rPr>
+                <w:sz w:val="22"/>
+              </w:rPr>
+              <w:t>{{n_20_h_p2}}</w:t>
+            </w:r>
           </w:p>
         </w:tc>
         <w:tc>

</xml_diff>